<commit_message>
Remove Hetzner from hosting costing doc — not available
</commit_message>
<xml_diff>
--- a/DOC/NexusFinance_Private_Account_Hosting_Costing.docx
+++ b/DOC/NexusFinance_Private_Account_Hosting_Costing.docx
@@ -718,7 +718,7 @@
                 <w:color w:val="0B1F2E"/>
                 <w:sz w:val="20"/>
               </w:rPr>
-              <w:t>A single VPS can host 10-20 small-to-medium clients running the NexusFinance stack (Node.js backend + Supabase/PostgreSQL). The most cost-effective option is Hetzner Cloud at $4.59/month per VPS, yielding $0.23-0.46 per client per month.</w:t>
+              <w:t>A single VPS can host 10-20 small-to-medium clients running the NexusFinance stack (Node.js backend + Supabase/PostgreSQL). The most cost-effective option is Hostinger KVM 2 at $8.99/month per VPS, yielding $0.45-0.90 per client per month.</w:t>
             </w:r>
           </w:p>
         </w:tc>
@@ -1998,7 +1998,7 @@
                 <w:color w:val="0B1F2E"/>
                 <w:sz w:val="19"/>
               </w:rPr>
-              <w:t>Hetzner</w:t>
+              <w:t>Hostinger</w:t>
             </w:r>
           </w:p>
         </w:tc>
@@ -2026,7 +2026,7 @@
                 <w:color w:val="0B1F2E"/>
                 <w:sz w:val="19"/>
               </w:rPr>
-              <w:t>CX22</w:t>
+              <w:t>KVM 2</w:t>
             </w:r>
           </w:p>
         </w:tc>
@@ -2082,7 +2082,7 @@
                 <w:color w:val="0B1F2E"/>
                 <w:sz w:val="19"/>
               </w:rPr>
-              <w:t>4 GB</w:t>
+              <w:t>8 GB</w:t>
             </w:r>
           </w:p>
         </w:tc>
@@ -2110,7 +2110,7 @@
                 <w:color w:val="0B1F2E"/>
                 <w:sz w:val="19"/>
               </w:rPr>
-              <w:t>40 GB NVMe</w:t>
+              <w:t>100 GB NVMe</w:t>
             </w:r>
           </w:p>
         </w:tc>
@@ -2138,7 +2138,7 @@
                 <w:color w:val="0B1F2E"/>
                 <w:sz w:val="19"/>
               </w:rPr>
-              <w:t>20 TB</w:t>
+              <w:t>2 TB</w:t>
             </w:r>
           </w:p>
         </w:tc>
@@ -2166,7 +2166,7 @@
                 <w:color w:val="0B1F2E"/>
                 <w:sz w:val="19"/>
               </w:rPr>
-              <w:t>$4.59</w:t>
+              <w:t>$8.99</w:t>
             </w:r>
           </w:p>
         </w:tc>
@@ -2194,7 +2194,7 @@
                 <w:color w:val="0B1F2E"/>
                 <w:sz w:val="19"/>
               </w:rPr>
-              <w:t>$55.08</w:t>
+              <w:t>$107.88</w:t>
             </w:r>
           </w:p>
         </w:tc>
@@ -2225,7 +2225,7 @@
                 <w:color w:val="0B1F2E"/>
                 <w:sz w:val="19"/>
               </w:rPr>
-              <w:t>Hostinger</w:t>
+              <w:t>Vultr</w:t>
             </w:r>
           </w:p>
         </w:tc>
@@ -2254,7 +2254,7 @@
                 <w:color w:val="0B1F2E"/>
                 <w:sz w:val="19"/>
               </w:rPr>
-              <w:t>KVM 2</w:t>
+              <w:t>HP 1GB</w:t>
             </w:r>
           </w:p>
         </w:tc>
@@ -2283,7 +2283,7 @@
                 <w:color w:val="0B1F2E"/>
                 <w:sz w:val="19"/>
               </w:rPr>
-              <w:t>2</w:t>
+              <w:t>1</w:t>
             </w:r>
           </w:p>
         </w:tc>
@@ -2312,7 +2312,7 @@
                 <w:color w:val="0B1F2E"/>
                 <w:sz w:val="19"/>
               </w:rPr>
-              <w:t>8 GB</w:t>
+              <w:t>1 GB</w:t>
             </w:r>
           </w:p>
         </w:tc>
@@ -2341,7 +2341,7 @@
                 <w:color w:val="0B1F2E"/>
                 <w:sz w:val="19"/>
               </w:rPr>
-              <w:t>100 GB NVMe</w:t>
+              <w:t>25 GB NVMe</w:t>
             </w:r>
           </w:p>
         </w:tc>
@@ -2399,7 +2399,7 @@
                 <w:color w:val="0B1F2E"/>
                 <w:sz w:val="19"/>
               </w:rPr>
-              <w:t>$8.99</w:t>
+              <w:t>$6.00</w:t>
             </w:r>
           </w:p>
         </w:tc>
@@ -2428,7 +2428,7 @@
                 <w:color w:val="0B1F2E"/>
                 <w:sz w:val="19"/>
               </w:rPr>
-              <w:t>$107.88</w:t>
+              <w:t>$72.00</w:t>
             </w:r>
           </w:p>
         </w:tc>
@@ -2458,7 +2458,7 @@
                 <w:color w:val="0B1F2E"/>
                 <w:sz w:val="19"/>
               </w:rPr>
-              <w:t>Vultr</w:t>
+              <w:t>DigitalOcean</w:t>
             </w:r>
           </w:p>
         </w:tc>
@@ -2486,7 +2486,7 @@
                 <w:color w:val="0B1F2E"/>
                 <w:sz w:val="19"/>
               </w:rPr>
-              <w:t>HP 1GB</w:t>
+              <w:t>Basic 2vCPU</w:t>
             </w:r>
           </w:p>
         </w:tc>
@@ -2514,7 +2514,7 @@
                 <w:color w:val="0B1F2E"/>
                 <w:sz w:val="19"/>
               </w:rPr>
-              <w:t>1</w:t>
+              <w:t>2</w:t>
             </w:r>
           </w:p>
         </w:tc>
@@ -2542,7 +2542,7 @@
                 <w:color w:val="0B1F2E"/>
                 <w:sz w:val="19"/>
               </w:rPr>
-              <w:t>1 GB</w:t>
+              <w:t>2 GB</w:t>
             </w:r>
           </w:p>
         </w:tc>
@@ -2570,7 +2570,7 @@
                 <w:color w:val="0B1F2E"/>
                 <w:sz w:val="19"/>
               </w:rPr>
-              <w:t>25 GB NVMe</w:t>
+              <w:t>60 GB SSD</w:t>
             </w:r>
           </w:p>
         </w:tc>
@@ -2598,7 +2598,7 @@
                 <w:color w:val="0B1F2E"/>
                 <w:sz w:val="19"/>
               </w:rPr>
-              <w:t>2 TB</w:t>
+              <w:t>3 TB</w:t>
             </w:r>
           </w:p>
         </w:tc>
@@ -2626,7 +2626,7 @@
                 <w:color w:val="0B1F2E"/>
                 <w:sz w:val="19"/>
               </w:rPr>
-              <w:t>$6.00</w:t>
+              <w:t>$18.00</w:t>
             </w:r>
           </w:p>
         </w:tc>
@@ -2654,7 +2654,7 @@
                 <w:color w:val="0B1F2E"/>
                 <w:sz w:val="19"/>
               </w:rPr>
-              <w:t>$72.00</w:t>
+              <w:t>$216.00</w:t>
             </w:r>
           </w:p>
         </w:tc>
@@ -2685,7 +2685,7 @@
                 <w:color w:val="0B1F2E"/>
                 <w:sz w:val="19"/>
               </w:rPr>
-              <w:t>DigitalOcean</w:t>
+              <w:t>Railway</w:t>
             </w:r>
           </w:p>
         </w:tc>
@@ -2714,7 +2714,7 @@
                 <w:color w:val="0B1F2E"/>
                 <w:sz w:val="19"/>
               </w:rPr>
-              <w:t>Basic 2vCPU</w:t>
+              <w:t>Hobby</w:t>
             </w:r>
           </w:p>
         </w:tc>
@@ -2743,7 +2743,7 @@
                 <w:color w:val="0B1F2E"/>
                 <w:sz w:val="19"/>
               </w:rPr>
-              <w:t>2</w:t>
+              <w:t>Shared</w:t>
             </w:r>
           </w:p>
         </w:tc>
@@ -2772,7 +2772,7 @@
                 <w:color w:val="0B1F2E"/>
                 <w:sz w:val="19"/>
               </w:rPr>
-              <w:t>2 GB</w:t>
+              <w:t>512 MB</w:t>
             </w:r>
           </w:p>
         </w:tc>
@@ -2801,7 +2801,7 @@
                 <w:color w:val="0B1F2E"/>
                 <w:sz w:val="19"/>
               </w:rPr>
-              <w:t>60 GB SSD</w:t>
+              <w:t>Volume</w:t>
             </w:r>
           </w:p>
         </w:tc>
@@ -2830,7 +2830,7 @@
                 <w:color w:val="0B1F2E"/>
                 <w:sz w:val="19"/>
               </w:rPr>
-              <w:t>3 TB</w:t>
+              <w:t>100 GB</w:t>
             </w:r>
           </w:p>
         </w:tc>
@@ -2859,7 +2859,7 @@
                 <w:color w:val="0B1F2E"/>
                 <w:sz w:val="19"/>
               </w:rPr>
-              <w:t>$18.00</w:t>
+              <w:t>$5.00*</w:t>
             </w:r>
           </w:p>
         </w:tc>
@@ -2888,7 +2888,7 @@
                 <w:color w:val="0B1F2E"/>
                 <w:sz w:val="19"/>
               </w:rPr>
-              <w:t>$216.00</w:t>
+              <w:t>$60.00*</w:t>
             </w:r>
           </w:p>
         </w:tc>
@@ -2918,7 +2918,7 @@
                 <w:color w:val="0B1F2E"/>
                 <w:sz w:val="19"/>
               </w:rPr>
-              <w:t>Railway</w:t>
+              <w:t>Render</w:t>
             </w:r>
           </w:p>
         </w:tc>
@@ -2946,7 +2946,7 @@
                 <w:color w:val="0B1F2E"/>
                 <w:sz w:val="19"/>
               </w:rPr>
-              <w:t>Hobby</w:t>
+              <w:t>Starter</w:t>
             </w:r>
           </w:p>
         </w:tc>
@@ -2974,7 +2974,7 @@
                 <w:color w:val="0B1F2E"/>
                 <w:sz w:val="19"/>
               </w:rPr>
-              <w:t>Shared</w:t>
+              <w:t>0.5</w:t>
             </w:r>
           </w:p>
         </w:tc>
@@ -3030,7 +3030,7 @@
                 <w:color w:val="0B1F2E"/>
                 <w:sz w:val="19"/>
               </w:rPr>
-              <w:t>Volume</w:t>
+              <w:t>Persistent</w:t>
             </w:r>
           </w:p>
         </w:tc>
@@ -3058,7 +3058,7 @@
                 <w:color w:val="0B1F2E"/>
                 <w:sz w:val="19"/>
               </w:rPr>
-              <w:t>100 GB</w:t>
+              <w:t>5 GB</w:t>
             </w:r>
           </w:p>
         </w:tc>
@@ -3086,247 +3086,13 @@
                 <w:color w:val="0B1F2E"/>
                 <w:sz w:val="19"/>
               </w:rPr>
-              <w:t>$5.00*</w:t>
+              <w:t>$7.00</w:t>
             </w:r>
           </w:p>
         </w:tc>
         <w:tc>
           <w:tcPr>
             <w:tcW w:type="dxa" w:w="1152"/>
-            <w:tcMar>
-              <w:top w:w="80" w:type="dxa"/>
-              <w:start w:w="120" w:type="dxa"/>
-              <w:bottom w:w="80" w:type="dxa"/>
-              <w:end w:w="120" w:type="dxa"/>
-            </w:tcMar>
-            <w:vAlign w:val="center"/>
-          </w:tcPr>
-          <w:p>
-            <w:pPr>
-              <w:spacing w:after="20"/>
-            </w:pPr>
-            <w:r/>
-            <w:r>
-              <w:rPr>
-                <w:rFonts w:ascii="Segoe UI" w:hAnsi="Segoe UI" w:cs="Segoe UI"/>
-                <w:b w:val="0"/>
-                <w:i w:val="0"/>
-                <w:color w:val="0B1F2E"/>
-                <w:sz w:val="19"/>
-              </w:rPr>
-              <w:t>$60.00*</w:t>
-            </w:r>
-          </w:p>
-        </w:tc>
-      </w:tr>
-      <w:tr>
-        <w:tc>
-          <w:tcPr>
-            <w:tcW w:type="dxa" w:w="1440"/>
-            <w:shd w:val="clear" w:fill="F4F8FA"/>
-            <w:tcMar>
-              <w:top w:w="80" w:type="dxa"/>
-              <w:start w:w="120" w:type="dxa"/>
-              <w:bottom w:w="80" w:type="dxa"/>
-              <w:end w:w="120" w:type="dxa"/>
-            </w:tcMar>
-            <w:vAlign w:val="center"/>
-          </w:tcPr>
-          <w:p>
-            <w:pPr>
-              <w:spacing w:after="20"/>
-            </w:pPr>
-            <w:r/>
-            <w:r>
-              <w:rPr>
-                <w:rFonts w:ascii="Segoe UI" w:hAnsi="Segoe UI" w:cs="Segoe UI"/>
-                <w:b w:val="0"/>
-                <w:i w:val="0"/>
-                <w:color w:val="0B1F2E"/>
-                <w:sz w:val="19"/>
-              </w:rPr>
-              <w:t>Render</w:t>
-            </w:r>
-          </w:p>
-        </w:tc>
-        <w:tc>
-          <w:tcPr>
-            <w:tcW w:type="dxa" w:w="1296"/>
-            <w:shd w:val="clear" w:fill="F4F8FA"/>
-            <w:tcMar>
-              <w:top w:w="80" w:type="dxa"/>
-              <w:start w:w="120" w:type="dxa"/>
-              <w:bottom w:w="80" w:type="dxa"/>
-              <w:end w:w="120" w:type="dxa"/>
-            </w:tcMar>
-            <w:vAlign w:val="center"/>
-          </w:tcPr>
-          <w:p>
-            <w:pPr>
-              <w:spacing w:after="20"/>
-            </w:pPr>
-            <w:r/>
-            <w:r>
-              <w:rPr>
-                <w:rFonts w:ascii="Segoe UI" w:hAnsi="Segoe UI" w:cs="Segoe UI"/>
-                <w:b w:val="0"/>
-                <w:i w:val="0"/>
-                <w:color w:val="0B1F2E"/>
-                <w:sz w:val="19"/>
-              </w:rPr>
-              <w:t>Starter</w:t>
-            </w:r>
-          </w:p>
-        </w:tc>
-        <w:tc>
-          <w:tcPr>
-            <w:tcW w:type="dxa" w:w="720"/>
-            <w:shd w:val="clear" w:fill="F4F8FA"/>
-            <w:tcMar>
-              <w:top w:w="80" w:type="dxa"/>
-              <w:start w:w="120" w:type="dxa"/>
-              <w:bottom w:w="80" w:type="dxa"/>
-              <w:end w:w="120" w:type="dxa"/>
-            </w:tcMar>
-            <w:vAlign w:val="center"/>
-          </w:tcPr>
-          <w:p>
-            <w:pPr>
-              <w:spacing w:after="20"/>
-            </w:pPr>
-            <w:r/>
-            <w:r>
-              <w:rPr>
-                <w:rFonts w:ascii="Segoe UI" w:hAnsi="Segoe UI" w:cs="Segoe UI"/>
-                <w:b w:val="0"/>
-                <w:i w:val="0"/>
-                <w:color w:val="0B1F2E"/>
-                <w:sz w:val="19"/>
-              </w:rPr>
-              <w:t>0.5</w:t>
-            </w:r>
-          </w:p>
-        </w:tc>
-        <w:tc>
-          <w:tcPr>
-            <w:tcW w:type="dxa" w:w="1008"/>
-            <w:shd w:val="clear" w:fill="F4F8FA"/>
-            <w:tcMar>
-              <w:top w:w="80" w:type="dxa"/>
-              <w:start w:w="120" w:type="dxa"/>
-              <w:bottom w:w="80" w:type="dxa"/>
-              <w:end w:w="120" w:type="dxa"/>
-            </w:tcMar>
-            <w:vAlign w:val="center"/>
-          </w:tcPr>
-          <w:p>
-            <w:pPr>
-              <w:spacing w:after="20"/>
-            </w:pPr>
-            <w:r/>
-            <w:r>
-              <w:rPr>
-                <w:rFonts w:ascii="Segoe UI" w:hAnsi="Segoe UI" w:cs="Segoe UI"/>
-                <w:b w:val="0"/>
-                <w:i w:val="0"/>
-                <w:color w:val="0B1F2E"/>
-                <w:sz w:val="19"/>
-              </w:rPr>
-              <w:t>512 MB</w:t>
-            </w:r>
-          </w:p>
-        </w:tc>
-        <w:tc>
-          <w:tcPr>
-            <w:tcW w:type="dxa" w:w="1440"/>
-            <w:shd w:val="clear" w:fill="F4F8FA"/>
-            <w:tcMar>
-              <w:top w:w="80" w:type="dxa"/>
-              <w:start w:w="120" w:type="dxa"/>
-              <w:bottom w:w="80" w:type="dxa"/>
-              <w:end w:w="120" w:type="dxa"/>
-            </w:tcMar>
-            <w:vAlign w:val="center"/>
-          </w:tcPr>
-          <w:p>
-            <w:pPr>
-              <w:spacing w:after="20"/>
-            </w:pPr>
-            <w:r/>
-            <w:r>
-              <w:rPr>
-                <w:rFonts w:ascii="Segoe UI" w:hAnsi="Segoe UI" w:cs="Segoe UI"/>
-                <w:b w:val="0"/>
-                <w:i w:val="0"/>
-                <w:color w:val="0B1F2E"/>
-                <w:sz w:val="19"/>
-              </w:rPr>
-              <w:t>Persistent</w:t>
-            </w:r>
-          </w:p>
-        </w:tc>
-        <w:tc>
-          <w:tcPr>
-            <w:tcW w:type="dxa" w:w="1152"/>
-            <w:shd w:val="clear" w:fill="F4F8FA"/>
-            <w:tcMar>
-              <w:top w:w="80" w:type="dxa"/>
-              <w:start w:w="120" w:type="dxa"/>
-              <w:bottom w:w="80" w:type="dxa"/>
-              <w:end w:w="120" w:type="dxa"/>
-            </w:tcMar>
-            <w:vAlign w:val="center"/>
-          </w:tcPr>
-          <w:p>
-            <w:pPr>
-              <w:spacing w:after="20"/>
-            </w:pPr>
-            <w:r/>
-            <w:r>
-              <w:rPr>
-                <w:rFonts w:ascii="Segoe UI" w:hAnsi="Segoe UI" w:cs="Segoe UI"/>
-                <w:b w:val="0"/>
-                <w:i w:val="0"/>
-                <w:color w:val="0B1F2E"/>
-                <w:sz w:val="19"/>
-              </w:rPr>
-              <w:t>5 GB</w:t>
-            </w:r>
-          </w:p>
-        </w:tc>
-        <w:tc>
-          <w:tcPr>
-            <w:tcW w:type="dxa" w:w="1008"/>
-            <w:shd w:val="clear" w:fill="F4F8FA"/>
-            <w:tcMar>
-              <w:top w:w="80" w:type="dxa"/>
-              <w:start w:w="120" w:type="dxa"/>
-              <w:bottom w:w="80" w:type="dxa"/>
-              <w:end w:w="120" w:type="dxa"/>
-            </w:tcMar>
-            <w:vAlign w:val="center"/>
-          </w:tcPr>
-          <w:p>
-            <w:pPr>
-              <w:spacing w:after="20"/>
-            </w:pPr>
-            <w:r/>
-            <w:r>
-              <w:rPr>
-                <w:rFonts w:ascii="Segoe UI" w:hAnsi="Segoe UI" w:cs="Segoe UI"/>
-                <w:b w:val="0"/>
-                <w:i w:val="0"/>
-                <w:color w:val="0B1F2E"/>
-                <w:sz w:val="19"/>
-              </w:rPr>
-              <w:t>$7.00</w:t>
-            </w:r>
-          </w:p>
-        </w:tc>
-        <w:tc>
-          <w:tcPr>
-            <w:tcW w:type="dxa" w:w="1152"/>
-            <w:shd w:val="clear" w:fill="F4F8FA"/>
             <w:tcMar>
               <w:top w:w="80" w:type="dxa"/>
               <w:start w:w="120" w:type="dxa"/>
@@ -3396,13 +3162,12 @@
         <w:tblLook w:firstColumn="1" w:firstRow="1" w:lastColumn="0" w:lastRow="0" w:noHBand="0" w:noVBand="1" w:val="04A0"/>
       </w:tblPr>
       <w:tblGrid>
-        <w:gridCol w:w="1331"/>
-        <w:gridCol w:w="1331"/>
-        <w:gridCol w:w="1331"/>
-        <w:gridCol w:w="1331"/>
-        <w:gridCol w:w="1331"/>
-        <w:gridCol w:w="1331"/>
-        <w:gridCol w:w="1331"/>
+        <w:gridCol w:w="1553"/>
+        <w:gridCol w:w="1553"/>
+        <w:gridCol w:w="1553"/>
+        <w:gridCol w:w="1553"/>
+        <w:gridCol w:w="1553"/>
+        <w:gridCol w:w="1553"/>
       </w:tblGrid>
       <w:tr>
         <w:tc>
@@ -3459,7 +3224,7 @@
                 <w:color w:val="FFFFFF"/>
                 <w:sz w:val="19"/>
               </w:rPr>
-              <w:t>Hetzner</w:t>
+              <w:t>Hostinger</w:t>
             </w:r>
           </w:p>
         </w:tc>
@@ -3488,7 +3253,7 @@
                 <w:color w:val="FFFFFF"/>
                 <w:sz w:val="19"/>
               </w:rPr>
-              <w:t>Hostinger</w:t>
+              <w:t>Vultr</w:t>
             </w:r>
           </w:p>
         </w:tc>
@@ -3517,7 +3282,7 @@
                 <w:color w:val="FFFFFF"/>
                 <w:sz w:val="19"/>
               </w:rPr>
-              <w:t>Vultr</w:t>
+              <w:t>DigitalOcean</w:t>
             </w:r>
           </w:p>
         </w:tc>
@@ -3546,7 +3311,7 @@
                 <w:color w:val="FFFFFF"/>
                 <w:sz w:val="19"/>
               </w:rPr>
-              <w:t>DigitalOcean</w:t>
+              <w:t>Railway</w:t>
             </w:r>
           </w:p>
         </w:tc>
@@ -3575,14 +3340,15 @@
                 <w:color w:val="FFFFFF"/>
                 <w:sz w:val="19"/>
               </w:rPr>
-              <w:t>Railway</w:t>
-            </w:r>
-          </w:p>
-        </w:tc>
-        <w:tc>
-          <w:tcPr>
-            <w:tcW w:type="dxa" w:w="1224"/>
-            <w:shd w:val="clear" w:fill="0B1F2E"/>
+              <w:t>Render</w:t>
+            </w:r>
+          </w:p>
+        </w:tc>
+      </w:tr>
+      <w:tr>
+        <w:tc>
+          <w:tcPr>
+            <w:tcW w:type="dxa" w:w="1440"/>
             <w:tcMar>
               <w:top w:w="80" w:type="dxa"/>
               <w:start w:w="120" w:type="dxa"/>
@@ -3593,26 +3359,24 @@
           </w:tcPr>
           <w:p>
             <w:pPr>
-              <w:jc w:val="left"/>
+              <w:spacing w:after="20"/>
             </w:pPr>
             <w:r/>
             <w:r>
               <w:rPr>
                 <w:rFonts w:ascii="Segoe UI" w:hAnsi="Segoe UI" w:cs="Segoe UI"/>
-                <w:b/>
-                <w:i w:val="0"/>
-                <w:color w:val="FFFFFF"/>
+                <w:b w:val="0"/>
+                <w:i w:val="0"/>
+                <w:color w:val="0B1F2E"/>
                 <w:sz w:val="19"/>
               </w:rPr>
-              <w:t>Render</w:t>
-            </w:r>
-          </w:p>
-        </w:tc>
-      </w:tr>
-      <w:tr>
-        <w:tc>
-          <w:tcPr>
-            <w:tcW w:type="dxa" w:w="1440"/>
+              <w:t>Managed DB</w:t>
+            </w:r>
+          </w:p>
+        </w:tc>
+        <w:tc>
+          <w:tcPr>
+            <w:tcW w:type="dxa" w:w="1224"/>
             <w:tcMar>
               <w:top w:w="80" w:type="dxa"/>
               <w:start w:w="120" w:type="dxa"/>
@@ -3634,7 +3398,7 @@
                 <w:color w:val="0B1F2E"/>
                 <w:sz w:val="19"/>
               </w:rPr>
-              <w:t>Managed DB</w:t>
+              <w:t>No</w:t>
             </w:r>
           </w:p>
         </w:tc>
@@ -3690,7 +3454,7 @@
                 <w:color w:val="0B1F2E"/>
                 <w:sz w:val="19"/>
               </w:rPr>
-              <w:t>No</w:t>
+              <w:t>Yes ($15+)</w:t>
             </w:r>
           </w:p>
         </w:tc>
@@ -3718,7 +3482,7 @@
                 <w:color w:val="0B1F2E"/>
                 <w:sz w:val="19"/>
               </w:rPr>
-              <w:t>No</w:t>
+              <w:t>Yes</w:t>
             </w:r>
           </w:p>
         </w:tc>
@@ -3746,13 +3510,16 @@
                 <w:color w:val="0B1F2E"/>
                 <w:sz w:val="19"/>
               </w:rPr>
-              <w:t>Yes ($15+)</w:t>
-            </w:r>
-          </w:p>
-        </w:tc>
-        <w:tc>
-          <w:tcPr>
-            <w:tcW w:type="dxa" w:w="1224"/>
+              <w:t>Yes ($7+)</w:t>
+            </w:r>
+          </w:p>
+        </w:tc>
+      </w:tr>
+      <w:tr>
+        <w:tc>
+          <w:tcPr>
+            <w:tcW w:type="dxa" w:w="1440"/>
+            <w:shd w:val="clear" w:fill="F4F8FA"/>
             <w:tcMar>
               <w:top w:w="80" w:type="dxa"/>
               <w:start w:w="120" w:type="dxa"/>
@@ -3774,13 +3541,14 @@
                 <w:color w:val="0B1F2E"/>
                 <w:sz w:val="19"/>
               </w:rPr>
-              <w:t>Yes</w:t>
+              <w:t>Auto-scaling</w:t>
             </w:r>
           </w:p>
         </w:tc>
         <w:tc>
           <w:tcPr>
             <w:tcW w:type="dxa" w:w="1224"/>
+            <w:shd w:val="clear" w:fill="F4F8FA"/>
             <w:tcMar>
               <w:top w:w="80" w:type="dxa"/>
               <w:start w:w="120" w:type="dxa"/>
@@ -3802,15 +3570,13 @@
                 <w:color w:val="0B1F2E"/>
                 <w:sz w:val="19"/>
               </w:rPr>
-              <w:t>Yes ($7+)</w:t>
-            </w:r>
-          </w:p>
-        </w:tc>
-      </w:tr>
-      <w:tr>
-        <w:tc>
-          <w:tcPr>
-            <w:tcW w:type="dxa" w:w="1440"/>
+              <w:t>No</w:t>
+            </w:r>
+          </w:p>
+        </w:tc>
+        <w:tc>
+          <w:tcPr>
+            <w:tcW w:type="dxa" w:w="1224"/>
             <w:shd w:val="clear" w:fill="F4F8FA"/>
             <w:tcMar>
               <w:top w:w="80" w:type="dxa"/>
@@ -3833,7 +3599,7 @@
                 <w:color w:val="0B1F2E"/>
                 <w:sz w:val="19"/>
               </w:rPr>
-              <w:t>Auto-scaling</w:t>
+              <w:t>No</w:t>
             </w:r>
           </w:p>
         </w:tc>
@@ -3862,7 +3628,7 @@
                 <w:color w:val="0B1F2E"/>
                 <w:sz w:val="19"/>
               </w:rPr>
-              <w:t>No</w:t>
+              <w:t>Yes</w:t>
             </w:r>
           </w:p>
         </w:tc>
@@ -3891,7 +3657,7 @@
                 <w:color w:val="0B1F2E"/>
                 <w:sz w:val="19"/>
               </w:rPr>
-              <w:t>No</w:t>
+              <w:t>Yes</w:t>
             </w:r>
           </w:p>
         </w:tc>
@@ -3920,14 +3686,15 @@
                 <w:color w:val="0B1F2E"/>
                 <w:sz w:val="19"/>
               </w:rPr>
-              <w:t>No</w:t>
-            </w:r>
-          </w:p>
-        </w:tc>
-        <w:tc>
-          <w:tcPr>
-            <w:tcW w:type="dxa" w:w="1224"/>
-            <w:shd w:val="clear" w:fill="F4F8FA"/>
+              <w:t>Yes</w:t>
+            </w:r>
+          </w:p>
+        </w:tc>
+      </w:tr>
+      <w:tr>
+        <w:tc>
+          <w:tcPr>
+            <w:tcW w:type="dxa" w:w="1440"/>
             <w:tcMar>
               <w:top w:w="80" w:type="dxa"/>
               <w:start w:w="120" w:type="dxa"/>
@@ -3949,14 +3716,13 @@
                 <w:color w:val="0B1F2E"/>
                 <w:sz w:val="19"/>
               </w:rPr>
-              <w:t>Yes</w:t>
+              <w:t>Backups</w:t>
             </w:r>
           </w:p>
         </w:tc>
         <w:tc>
           <w:tcPr>
             <w:tcW w:type="dxa" w:w="1224"/>
-            <w:shd w:val="clear" w:fill="F4F8FA"/>
             <w:tcMar>
               <w:top w:w="80" w:type="dxa"/>
               <w:start w:w="120" w:type="dxa"/>
@@ -3978,14 +3744,13 @@
                 <w:color w:val="0B1F2E"/>
                 <w:sz w:val="19"/>
               </w:rPr>
-              <w:t>Yes</w:t>
+              <w:t>Weekly free</w:t>
             </w:r>
           </w:p>
         </w:tc>
         <w:tc>
           <w:tcPr>
             <w:tcW w:type="dxa" w:w="1224"/>
-            <w:shd w:val="clear" w:fill="F4F8FA"/>
             <w:tcMar>
               <w:top w:w="80" w:type="dxa"/>
               <w:start w:w="120" w:type="dxa"/>
@@ -4007,15 +3772,13 @@
                 <w:color w:val="0B1F2E"/>
                 <w:sz w:val="19"/>
               </w:rPr>
-              <w:t>Yes</w:t>
-            </w:r>
-          </w:p>
-        </w:tc>
-      </w:tr>
-      <w:tr>
-        <w:tc>
-          <w:tcPr>
-            <w:tcW w:type="dxa" w:w="1440"/>
+              <w:t>Paid add-on</w:t>
+            </w:r>
+          </w:p>
+        </w:tc>
+        <w:tc>
+          <w:tcPr>
+            <w:tcW w:type="dxa" w:w="1224"/>
             <w:tcMar>
               <w:top w:w="80" w:type="dxa"/>
               <w:start w:w="120" w:type="dxa"/>
@@ -4037,7 +3800,7 @@
                 <w:color w:val="0B1F2E"/>
                 <w:sz w:val="19"/>
               </w:rPr>
-              <w:t>Backups</w:t>
+              <w:t>20% extra</w:t>
             </w:r>
           </w:p>
         </w:tc>
@@ -4065,7 +3828,7 @@
                 <w:color w:val="0B1F2E"/>
                 <w:sz w:val="19"/>
               </w:rPr>
-              <w:t>Paid add-on</w:t>
+              <w:t>Included</w:t>
             </w:r>
           </w:p>
         </w:tc>
@@ -4093,13 +3856,16 @@
                 <w:color w:val="0B1F2E"/>
                 <w:sz w:val="19"/>
               </w:rPr>
-              <w:t>Weekly free</w:t>
-            </w:r>
-          </w:p>
-        </w:tc>
-        <w:tc>
-          <w:tcPr>
-            <w:tcW w:type="dxa" w:w="1224"/>
+              <w:t>Included</w:t>
+            </w:r>
+          </w:p>
+        </w:tc>
+      </w:tr>
+      <w:tr>
+        <w:tc>
+          <w:tcPr>
+            <w:tcW w:type="dxa" w:w="1440"/>
+            <w:shd w:val="clear" w:fill="F4F8FA"/>
             <w:tcMar>
               <w:top w:w="80" w:type="dxa"/>
               <w:start w:w="120" w:type="dxa"/>
@@ -4121,13 +3887,14 @@
                 <w:color w:val="0B1F2E"/>
                 <w:sz w:val="19"/>
               </w:rPr>
-              <w:t>Paid add-on</w:t>
+              <w:t>SSL</w:t>
             </w:r>
           </w:p>
         </w:tc>
         <w:tc>
           <w:tcPr>
             <w:tcW w:type="dxa" w:w="1224"/>
+            <w:shd w:val="clear" w:fill="F4F8FA"/>
             <w:tcMar>
               <w:top w:w="80" w:type="dxa"/>
               <w:start w:w="120" w:type="dxa"/>
@@ -4149,13 +3916,14 @@
                 <w:color w:val="0B1F2E"/>
                 <w:sz w:val="19"/>
               </w:rPr>
-              <w:t>20% extra</w:t>
+              <w:t>Free Let's Encrypt</w:t>
             </w:r>
           </w:p>
         </w:tc>
         <w:tc>
           <w:tcPr>
             <w:tcW w:type="dxa" w:w="1224"/>
+            <w:shd w:val="clear" w:fill="F4F8FA"/>
             <w:tcMar>
               <w:top w:w="80" w:type="dxa"/>
               <w:start w:w="120" w:type="dxa"/>
@@ -4177,13 +3945,14 @@
                 <w:color w:val="0B1F2E"/>
                 <w:sz w:val="19"/>
               </w:rPr>
-              <w:t>Included</w:t>
+              <w:t>Self-configure</w:t>
             </w:r>
           </w:p>
         </w:tc>
         <w:tc>
           <w:tcPr>
             <w:tcW w:type="dxa" w:w="1224"/>
+            <w:shd w:val="clear" w:fill="F4F8FA"/>
             <w:tcMar>
               <w:top w:w="80" w:type="dxa"/>
               <w:start w:w="120" w:type="dxa"/>
@@ -4205,15 +3974,13 @@
                 <w:color w:val="0B1F2E"/>
                 <w:sz w:val="19"/>
               </w:rPr>
-              <w:t>Included</w:t>
-            </w:r>
-          </w:p>
-        </w:tc>
-      </w:tr>
-      <w:tr>
-        <w:tc>
-          <w:tcPr>
-            <w:tcW w:type="dxa" w:w="1440"/>
+              <w:t>Self-configure</w:t>
+            </w:r>
+          </w:p>
+        </w:tc>
+        <w:tc>
+          <w:tcPr>
+            <w:tcW w:type="dxa" w:w="1224"/>
             <w:shd w:val="clear" w:fill="F4F8FA"/>
             <w:tcMar>
               <w:top w:w="80" w:type="dxa"/>
@@ -4236,7 +4003,7 @@
                 <w:color w:val="0B1F2E"/>
                 <w:sz w:val="19"/>
               </w:rPr>
-              <w:t>SSL</w:t>
+              <w:t>Auto</w:t>
             </w:r>
           </w:p>
         </w:tc>
@@ -4265,14 +4032,15 @@
                 <w:color w:val="0B1F2E"/>
                 <w:sz w:val="19"/>
               </w:rPr>
-              <w:t>Self-configure</w:t>
-            </w:r>
-          </w:p>
-        </w:tc>
-        <w:tc>
-          <w:tcPr>
-            <w:tcW w:type="dxa" w:w="1224"/>
-            <w:shd w:val="clear" w:fill="F4F8FA"/>
+              <w:t>Auto</w:t>
+            </w:r>
+          </w:p>
+        </w:tc>
+      </w:tr>
+      <w:tr>
+        <w:tc>
+          <w:tcPr>
+            <w:tcW w:type="dxa" w:w="1440"/>
             <w:tcMar>
               <w:top w:w="80" w:type="dxa"/>
               <w:start w:w="120" w:type="dxa"/>
@@ -4294,14 +4062,13 @@
                 <w:color w:val="0B1F2E"/>
                 <w:sz w:val="19"/>
               </w:rPr>
-              <w:t>Free Let's Encrypt</w:t>
+              <w:t>Support</w:t>
             </w:r>
           </w:p>
         </w:tc>
         <w:tc>
           <w:tcPr>
             <w:tcW w:type="dxa" w:w="1224"/>
-            <w:shd w:val="clear" w:fill="F4F8FA"/>
             <w:tcMar>
               <w:top w:w="80" w:type="dxa"/>
               <w:start w:w="120" w:type="dxa"/>
@@ -4323,14 +4090,13 @@
                 <w:color w:val="0B1F2E"/>
                 <w:sz w:val="19"/>
               </w:rPr>
-              <w:t>Self-configure</w:t>
+              <w:t>24/7 chat</w:t>
             </w:r>
           </w:p>
         </w:tc>
         <w:tc>
           <w:tcPr>
             <w:tcW w:type="dxa" w:w="1224"/>
-            <w:shd w:val="clear" w:fill="F4F8FA"/>
             <w:tcMar>
               <w:top w:w="80" w:type="dxa"/>
               <w:start w:w="120" w:type="dxa"/>
@@ -4352,14 +4118,13 @@
                 <w:color w:val="0B1F2E"/>
                 <w:sz w:val="19"/>
               </w:rPr>
-              <w:t>Self-configure</w:t>
+              <w:t>Ticket only</w:t>
             </w:r>
           </w:p>
         </w:tc>
         <w:tc>
           <w:tcPr>
             <w:tcW w:type="dxa" w:w="1224"/>
-            <w:shd w:val="clear" w:fill="F4F8FA"/>
             <w:tcMar>
               <w:top w:w="80" w:type="dxa"/>
               <w:start w:w="120" w:type="dxa"/>
@@ -4381,14 +4146,13 @@
                 <w:color w:val="0B1F2E"/>
                 <w:sz w:val="19"/>
               </w:rPr>
-              <w:t>Auto</w:t>
+              <w:t>Ticket only</w:t>
             </w:r>
           </w:p>
         </w:tc>
         <w:tc>
           <w:tcPr>
             <w:tcW w:type="dxa" w:w="1224"/>
-            <w:shd w:val="clear" w:fill="F4F8FA"/>
             <w:tcMar>
               <w:top w:w="80" w:type="dxa"/>
               <w:start w:w="120" w:type="dxa"/>
@@ -4410,15 +4174,13 @@
                 <w:color w:val="0B1F2E"/>
                 <w:sz w:val="19"/>
               </w:rPr>
-              <w:t>Auto</w:t>
-            </w:r>
-          </w:p>
-        </w:tc>
-      </w:tr>
-      <w:tr>
-        <w:tc>
-          <w:tcPr>
-            <w:tcW w:type="dxa" w:w="1440"/>
+              <w:t>Discord</w:t>
+            </w:r>
+          </w:p>
+        </w:tc>
+        <w:tc>
+          <w:tcPr>
+            <w:tcW w:type="dxa" w:w="1224"/>
             <w:tcMar>
               <w:top w:w="80" w:type="dxa"/>
               <w:start w:w="120" w:type="dxa"/>
@@ -4440,13 +4202,16 @@
                 <w:color w:val="0B1F2E"/>
                 <w:sz w:val="19"/>
               </w:rPr>
-              <w:t>Support</w:t>
-            </w:r>
-          </w:p>
-        </w:tc>
-        <w:tc>
-          <w:tcPr>
-            <w:tcW w:type="dxa" w:w="1224"/>
+              <w:t>Email</w:t>
+            </w:r>
+          </w:p>
+        </w:tc>
+      </w:tr>
+      <w:tr>
+        <w:tc>
+          <w:tcPr>
+            <w:tcW w:type="dxa" w:w="1440"/>
+            <w:shd w:val="clear" w:fill="F4F8FA"/>
             <w:tcMar>
               <w:top w:w="80" w:type="dxa"/>
               <w:start w:w="120" w:type="dxa"/>
@@ -4468,13 +4233,14 @@
                 <w:color w:val="0B1F2E"/>
                 <w:sz w:val="19"/>
               </w:rPr>
-              <w:t>Ticket only</w:t>
+              <w:t>Regions</w:t>
             </w:r>
           </w:p>
         </w:tc>
         <w:tc>
           <w:tcPr>
             <w:tcW w:type="dxa" w:w="1224"/>
+            <w:shd w:val="clear" w:fill="F4F8FA"/>
             <w:tcMar>
               <w:top w:w="80" w:type="dxa"/>
               <w:start w:w="120" w:type="dxa"/>
@@ -4496,13 +4262,14 @@
                 <w:color w:val="0B1F2E"/>
                 <w:sz w:val="19"/>
               </w:rPr>
-              <w:t>24/7 chat</w:t>
+              <w:t>Global</w:t>
             </w:r>
           </w:p>
         </w:tc>
         <w:tc>
           <w:tcPr>
             <w:tcW w:type="dxa" w:w="1224"/>
+            <w:shd w:val="clear" w:fill="F4F8FA"/>
             <w:tcMar>
               <w:top w:w="80" w:type="dxa"/>
               <w:start w:w="120" w:type="dxa"/>
@@ -4524,13 +4291,14 @@
                 <w:color w:val="0B1F2E"/>
                 <w:sz w:val="19"/>
               </w:rPr>
-              <w:t>Ticket only</w:t>
+              <w:t>32 regions</w:t>
             </w:r>
           </w:p>
         </w:tc>
         <w:tc>
           <w:tcPr>
             <w:tcW w:type="dxa" w:w="1224"/>
+            <w:shd w:val="clear" w:fill="F4F8FA"/>
             <w:tcMar>
               <w:top w:w="80" w:type="dxa"/>
               <w:start w:w="120" w:type="dxa"/>
@@ -4552,13 +4320,14 @@
                 <w:color w:val="0B1F2E"/>
                 <w:sz w:val="19"/>
               </w:rPr>
-              <w:t>Ticket only</w:t>
+              <w:t>15 regions</w:t>
             </w:r>
           </w:p>
         </w:tc>
         <w:tc>
           <w:tcPr>
             <w:tcW w:type="dxa" w:w="1224"/>
+            <w:shd w:val="clear" w:fill="F4F8FA"/>
             <w:tcMar>
               <w:top w:w="80" w:type="dxa"/>
               <w:start w:w="120" w:type="dxa"/>
@@ -4580,13 +4349,14 @@
                 <w:color w:val="0B1F2E"/>
                 <w:sz w:val="19"/>
               </w:rPr>
-              <w:t>Discord</w:t>
+              <w:t>US (expanding)</w:t>
             </w:r>
           </w:p>
         </w:tc>
         <w:tc>
           <w:tcPr>
             <w:tcW w:type="dxa" w:w="1224"/>
+            <w:shd w:val="clear" w:fill="F4F8FA"/>
             <w:tcMar>
               <w:top w:w="80" w:type="dxa"/>
               <w:start w:w="120" w:type="dxa"/>
@@ -4608,7 +4378,7 @@
                 <w:color w:val="0B1F2E"/>
                 <w:sz w:val="19"/>
               </w:rPr>
-              <w:t>Email</w:t>
+              <w:t>US/EU/SG</w:t>
             </w:r>
           </w:p>
         </w:tc>
@@ -4617,7 +4387,6 @@
         <w:tc>
           <w:tcPr>
             <w:tcW w:type="dxa" w:w="1440"/>
-            <w:shd w:val="clear" w:fill="F4F8FA"/>
             <w:tcMar>
               <w:top w:w="80" w:type="dxa"/>
               <w:start w:w="120" w:type="dxa"/>
@@ -4639,14 +4408,13 @@
                 <w:color w:val="0B1F2E"/>
                 <w:sz w:val="19"/>
               </w:rPr>
-              <w:t>Regions</w:t>
+              <w:t>Uptime SLA</w:t>
             </w:r>
           </w:p>
         </w:tc>
         <w:tc>
           <w:tcPr>
             <w:tcW w:type="dxa" w:w="1224"/>
-            <w:shd w:val="clear" w:fill="F4F8FA"/>
             <w:tcMar>
               <w:top w:w="80" w:type="dxa"/>
               <w:start w:w="120" w:type="dxa"/>
@@ -4668,14 +4436,13 @@
                 <w:color w:val="0B1F2E"/>
                 <w:sz w:val="19"/>
               </w:rPr>
-              <w:t>EU + US</w:t>
+              <w:t>99.9%</w:t>
             </w:r>
           </w:p>
         </w:tc>
         <w:tc>
           <w:tcPr>
             <w:tcW w:type="dxa" w:w="1224"/>
-            <w:shd w:val="clear" w:fill="F4F8FA"/>
             <w:tcMar>
               <w:top w:w="80" w:type="dxa"/>
               <w:start w:w="120" w:type="dxa"/>
@@ -4697,14 +4464,13 @@
                 <w:color w:val="0B1F2E"/>
                 <w:sz w:val="19"/>
               </w:rPr>
-              <w:t>Global</w:t>
+              <w:t>100%</w:t>
             </w:r>
           </w:p>
         </w:tc>
         <w:tc>
           <w:tcPr>
             <w:tcW w:type="dxa" w:w="1224"/>
-            <w:shd w:val="clear" w:fill="F4F8FA"/>
             <w:tcMar>
               <w:top w:w="80" w:type="dxa"/>
               <w:start w:w="120" w:type="dxa"/>
@@ -4726,14 +4492,13 @@
                 <w:color w:val="0B1F2E"/>
                 <w:sz w:val="19"/>
               </w:rPr>
-              <w:t>32 regions</w:t>
+              <w:t>99.99%</w:t>
             </w:r>
           </w:p>
         </w:tc>
         <w:tc>
           <w:tcPr>
             <w:tcW w:type="dxa" w:w="1224"/>
-            <w:shd w:val="clear" w:fill="F4F8FA"/>
             <w:tcMar>
               <w:top w:w="80" w:type="dxa"/>
               <w:start w:w="120" w:type="dxa"/>
@@ -4755,14 +4520,13 @@
                 <w:color w:val="0B1F2E"/>
                 <w:sz w:val="19"/>
               </w:rPr>
-              <w:t>15 regions</w:t>
+              <w:t>99.5%</w:t>
             </w:r>
           </w:p>
         </w:tc>
         <w:tc>
           <w:tcPr>
             <w:tcW w:type="dxa" w:w="1224"/>
-            <w:shd w:val="clear" w:fill="F4F8FA"/>
             <w:tcMar>
               <w:top w:w="80" w:type="dxa"/>
               <w:start w:w="120" w:type="dxa"/>
@@ -4784,13 +4548,15 @@
                 <w:color w:val="0B1F2E"/>
                 <w:sz w:val="19"/>
               </w:rPr>
-              <w:t>US (expanding)</w:t>
-            </w:r>
-          </w:p>
-        </w:tc>
-        <w:tc>
-          <w:tcPr>
-            <w:tcW w:type="dxa" w:w="1224"/>
+              <w:t>99.9%</w:t>
+            </w:r>
+          </w:p>
+        </w:tc>
+      </w:tr>
+      <w:tr>
+        <w:tc>
+          <w:tcPr>
+            <w:tcW w:type="dxa" w:w="1440"/>
             <w:shd w:val="clear" w:fill="F4F8FA"/>
             <w:tcMar>
               <w:top w:w="80" w:type="dxa"/>
@@ -4813,265 +4579,7 @@
                 <w:color w:val="0B1F2E"/>
                 <w:sz w:val="19"/>
               </w:rPr>
-              <w:t>US/EU/SG</w:t>
-            </w:r>
-          </w:p>
-        </w:tc>
-      </w:tr>
-      <w:tr>
-        <w:tc>
-          <w:tcPr>
-            <w:tcW w:type="dxa" w:w="1440"/>
-            <w:tcMar>
-              <w:top w:w="80" w:type="dxa"/>
-              <w:start w:w="120" w:type="dxa"/>
-              <w:bottom w:w="80" w:type="dxa"/>
-              <w:end w:w="120" w:type="dxa"/>
-            </w:tcMar>
-            <w:vAlign w:val="center"/>
-          </w:tcPr>
-          <w:p>
-            <w:pPr>
-              <w:spacing w:after="20"/>
-            </w:pPr>
-            <w:r/>
-            <w:r>
-              <w:rPr>
-                <w:rFonts w:ascii="Segoe UI" w:hAnsi="Segoe UI" w:cs="Segoe UI"/>
-                <w:b w:val="0"/>
-                <w:i w:val="0"/>
-                <w:color w:val="0B1F2E"/>
-                <w:sz w:val="19"/>
-              </w:rPr>
-              <w:t>Uptime SLA</w:t>
-            </w:r>
-          </w:p>
-        </w:tc>
-        <w:tc>
-          <w:tcPr>
-            <w:tcW w:type="dxa" w:w="1224"/>
-            <w:tcMar>
-              <w:top w:w="80" w:type="dxa"/>
-              <w:start w:w="120" w:type="dxa"/>
-              <w:bottom w:w="80" w:type="dxa"/>
-              <w:end w:w="120" w:type="dxa"/>
-            </w:tcMar>
-            <w:vAlign w:val="center"/>
-          </w:tcPr>
-          <w:p>
-            <w:pPr>
-              <w:spacing w:after="20"/>
-            </w:pPr>
-            <w:r/>
-            <w:r>
-              <w:rPr>
-                <w:rFonts w:ascii="Segoe UI" w:hAnsi="Segoe UI" w:cs="Segoe UI"/>
-                <w:b w:val="0"/>
-                <w:i w:val="0"/>
-                <w:color w:val="0B1F2E"/>
-                <w:sz w:val="19"/>
-              </w:rPr>
-              <w:t>99.9%</w:t>
-            </w:r>
-          </w:p>
-        </w:tc>
-        <w:tc>
-          <w:tcPr>
-            <w:tcW w:type="dxa" w:w="1224"/>
-            <w:tcMar>
-              <w:top w:w="80" w:type="dxa"/>
-              <w:start w:w="120" w:type="dxa"/>
-              <w:bottom w:w="80" w:type="dxa"/>
-              <w:end w:w="120" w:type="dxa"/>
-            </w:tcMar>
-            <w:vAlign w:val="center"/>
-          </w:tcPr>
-          <w:p>
-            <w:pPr>
-              <w:spacing w:after="20"/>
-            </w:pPr>
-            <w:r/>
-            <w:r>
-              <w:rPr>
-                <w:rFonts w:ascii="Segoe UI" w:hAnsi="Segoe UI" w:cs="Segoe UI"/>
-                <w:b w:val="0"/>
-                <w:i w:val="0"/>
-                <w:color w:val="0B1F2E"/>
-                <w:sz w:val="19"/>
-              </w:rPr>
-              <w:t>99.9%</w:t>
-            </w:r>
-          </w:p>
-        </w:tc>
-        <w:tc>
-          <w:tcPr>
-            <w:tcW w:type="dxa" w:w="1224"/>
-            <w:tcMar>
-              <w:top w:w="80" w:type="dxa"/>
-              <w:start w:w="120" w:type="dxa"/>
-              <w:bottom w:w="80" w:type="dxa"/>
-              <w:end w:w="120" w:type="dxa"/>
-            </w:tcMar>
-            <w:vAlign w:val="center"/>
-          </w:tcPr>
-          <w:p>
-            <w:pPr>
-              <w:spacing w:after="20"/>
-            </w:pPr>
-            <w:r/>
-            <w:r>
-              <w:rPr>
-                <w:rFonts w:ascii="Segoe UI" w:hAnsi="Segoe UI" w:cs="Segoe UI"/>
-                <w:b w:val="0"/>
-                <w:i w:val="0"/>
-                <w:color w:val="0B1F2E"/>
-                <w:sz w:val="19"/>
-              </w:rPr>
-              <w:t>100%</w:t>
-            </w:r>
-          </w:p>
-        </w:tc>
-        <w:tc>
-          <w:tcPr>
-            <w:tcW w:type="dxa" w:w="1224"/>
-            <w:tcMar>
-              <w:top w:w="80" w:type="dxa"/>
-              <w:start w:w="120" w:type="dxa"/>
-              <w:bottom w:w="80" w:type="dxa"/>
-              <w:end w:w="120" w:type="dxa"/>
-            </w:tcMar>
-            <w:vAlign w:val="center"/>
-          </w:tcPr>
-          <w:p>
-            <w:pPr>
-              <w:spacing w:after="20"/>
-            </w:pPr>
-            <w:r/>
-            <w:r>
-              <w:rPr>
-                <w:rFonts w:ascii="Segoe UI" w:hAnsi="Segoe UI" w:cs="Segoe UI"/>
-                <w:b w:val="0"/>
-                <w:i w:val="0"/>
-                <w:color w:val="0B1F2E"/>
-                <w:sz w:val="19"/>
-              </w:rPr>
-              <w:t>99.99%</w:t>
-            </w:r>
-          </w:p>
-        </w:tc>
-        <w:tc>
-          <w:tcPr>
-            <w:tcW w:type="dxa" w:w="1224"/>
-            <w:tcMar>
-              <w:top w:w="80" w:type="dxa"/>
-              <w:start w:w="120" w:type="dxa"/>
-              <w:bottom w:w="80" w:type="dxa"/>
-              <w:end w:w="120" w:type="dxa"/>
-            </w:tcMar>
-            <w:vAlign w:val="center"/>
-          </w:tcPr>
-          <w:p>
-            <w:pPr>
-              <w:spacing w:after="20"/>
-            </w:pPr>
-            <w:r/>
-            <w:r>
-              <w:rPr>
-                <w:rFonts w:ascii="Segoe UI" w:hAnsi="Segoe UI" w:cs="Segoe UI"/>
-                <w:b w:val="0"/>
-                <w:i w:val="0"/>
-                <w:color w:val="0B1F2E"/>
-                <w:sz w:val="19"/>
-              </w:rPr>
-              <w:t>99.5%</w:t>
-            </w:r>
-          </w:p>
-        </w:tc>
-        <w:tc>
-          <w:tcPr>
-            <w:tcW w:type="dxa" w:w="1224"/>
-            <w:tcMar>
-              <w:top w:w="80" w:type="dxa"/>
-              <w:start w:w="120" w:type="dxa"/>
-              <w:bottom w:w="80" w:type="dxa"/>
-              <w:end w:w="120" w:type="dxa"/>
-            </w:tcMar>
-            <w:vAlign w:val="center"/>
-          </w:tcPr>
-          <w:p>
-            <w:pPr>
-              <w:spacing w:after="20"/>
-            </w:pPr>
-            <w:r/>
-            <w:r>
-              <w:rPr>
-                <w:rFonts w:ascii="Segoe UI" w:hAnsi="Segoe UI" w:cs="Segoe UI"/>
-                <w:b w:val="0"/>
-                <w:i w:val="0"/>
-                <w:color w:val="0B1F2E"/>
-                <w:sz w:val="19"/>
-              </w:rPr>
-              <w:t>99.9%</w:t>
-            </w:r>
-          </w:p>
-        </w:tc>
-      </w:tr>
-      <w:tr>
-        <w:tc>
-          <w:tcPr>
-            <w:tcW w:type="dxa" w:w="1440"/>
-            <w:shd w:val="clear" w:fill="F4F8FA"/>
-            <w:tcMar>
-              <w:top w:w="80" w:type="dxa"/>
-              <w:start w:w="120" w:type="dxa"/>
-              <w:bottom w:w="80" w:type="dxa"/>
-              <w:end w:w="120" w:type="dxa"/>
-            </w:tcMar>
-            <w:vAlign w:val="center"/>
-          </w:tcPr>
-          <w:p>
-            <w:pPr>
-              <w:spacing w:after="20"/>
-            </w:pPr>
-            <w:r/>
-            <w:r>
-              <w:rPr>
-                <w:rFonts w:ascii="Segoe UI" w:hAnsi="Segoe UI" w:cs="Segoe UI"/>
-                <w:b w:val="0"/>
-                <w:i w:val="0"/>
-                <w:color w:val="0B1F2E"/>
-                <w:sz w:val="19"/>
-              </w:rPr>
               <w:t>Root access</w:t>
-            </w:r>
-          </w:p>
-        </w:tc>
-        <w:tc>
-          <w:tcPr>
-            <w:tcW w:type="dxa" w:w="1224"/>
-            <w:shd w:val="clear" w:fill="F4F8FA"/>
-            <w:tcMar>
-              <w:top w:w="80" w:type="dxa"/>
-              <w:start w:w="120" w:type="dxa"/>
-              <w:bottom w:w="80" w:type="dxa"/>
-              <w:end w:w="120" w:type="dxa"/>
-            </w:tcMar>
-            <w:vAlign w:val="center"/>
-          </w:tcPr>
-          <w:p>
-            <w:pPr>
-              <w:spacing w:after="20"/>
-            </w:pPr>
-            <w:r/>
-            <w:r>
-              <w:rPr>
-                <w:rFonts w:ascii="Segoe UI" w:hAnsi="Segoe UI" w:cs="Segoe UI"/>
-                <w:b w:val="0"/>
-                <w:i w:val="0"/>
-                <w:color w:val="0B1F2E"/>
-                <w:sz w:val="19"/>
-              </w:rPr>
-              <w:t>Yes</w:t>
             </w:r>
           </w:p>
         </w:tc>
@@ -5400,7 +4908,7 @@
                 <w:color w:val="0B1F2E"/>
                 <w:sz w:val="19"/>
               </w:rPr>
-              <w:t>Hetzner</w:t>
+              <w:t>Hostinger</w:t>
             </w:r>
           </w:p>
         </w:tc>
@@ -5428,7 +4936,7 @@
                 <w:color w:val="0B1F2E"/>
                 <w:sz w:val="19"/>
               </w:rPr>
-              <w:t>$1.15</w:t>
+              <w:t>$1.12</w:t>
             </w:r>
           </w:p>
         </w:tc>
@@ -5456,7 +4964,7 @@
                 <w:color w:val="0B1F2E"/>
                 <w:sz w:val="19"/>
               </w:rPr>
-              <w:t>$2.30</w:t>
+              <w:t>$4.50</w:t>
             </w:r>
           </w:p>
         </w:tc>
@@ -5484,7 +4992,7 @@
                 <w:color w:val="0B1F2E"/>
                 <w:sz w:val="19"/>
               </w:rPr>
-              <w:t>CX22 — best overall value</w:t>
+              <w:t>KVM 2 — best overall value</w:t>
             </w:r>
           </w:p>
         </w:tc>
@@ -5515,7 +5023,7 @@
                 <w:color w:val="0B1F2E"/>
                 <w:sz w:val="19"/>
               </w:rPr>
-              <w:t>Hostinger</w:t>
+              <w:t>Vultr</w:t>
             </w:r>
           </w:p>
         </w:tc>
@@ -5544,7 +5052,7 @@
                 <w:color w:val="0B1F2E"/>
                 <w:sz w:val="19"/>
               </w:rPr>
-              <w:t>$1.12</w:t>
+              <w:t>$6.00</w:t>
             </w:r>
           </w:p>
         </w:tc>
@@ -5573,7 +5081,7 @@
                 <w:color w:val="0B1F2E"/>
                 <w:sz w:val="19"/>
               </w:rPr>
-              <w:t>$4.50</w:t>
+              <w:t>$6.00</w:t>
             </w:r>
           </w:p>
         </w:tc>
@@ -5602,7 +5110,7 @@
                 <w:color w:val="0B1F2E"/>
                 <w:sz w:val="19"/>
               </w:rPr>
-              <w:t>KVM 2 — most RAM per dollar</w:t>
+              <w:t>HP 1GB — good for single clients</w:t>
             </w:r>
           </w:p>
         </w:tc>
@@ -5632,7 +5140,7 @@
                 <w:color w:val="0B1F2E"/>
                 <w:sz w:val="19"/>
               </w:rPr>
-              <w:t>Vultr</w:t>
+              <w:t>DigitalOcean</w:t>
             </w:r>
           </w:p>
         </w:tc>
@@ -5660,7 +5168,7 @@
                 <w:color w:val="0B1F2E"/>
                 <w:sz w:val="19"/>
               </w:rPr>
-              <w:t>$6.00</w:t>
+              <w:t>$9.00</w:t>
             </w:r>
           </w:p>
         </w:tc>
@@ -5688,7 +5196,7 @@
                 <w:color w:val="0B1F2E"/>
                 <w:sz w:val="19"/>
               </w:rPr>
-              <w:t>$6.00</w:t>
+              <w:t>$9.00</w:t>
             </w:r>
           </w:p>
         </w:tc>
@@ -5716,7 +5224,7 @@
                 <w:color w:val="0B1F2E"/>
                 <w:sz w:val="19"/>
               </w:rPr>
-              <w:t>HP 1GB — good for single clients</w:t>
+              <w:t>Basic 2vCPU — ecosystem premium</w:t>
             </w:r>
           </w:p>
         </w:tc>
@@ -5747,7 +5255,7 @@
                 <w:color w:val="0B1F2E"/>
                 <w:sz w:val="19"/>
               </w:rPr>
-              <w:t>DigitalOcean</w:t>
+              <w:t>Railway</w:t>
             </w:r>
           </w:p>
         </w:tc>
@@ -5776,7 +5284,7 @@
                 <w:color w:val="0B1F2E"/>
                 <w:sz w:val="19"/>
               </w:rPr>
-              <w:t>$9.00</w:t>
+              <w:t>~$10.00</w:t>
             </w:r>
           </w:p>
         </w:tc>
@@ -5805,7 +5313,7 @@
                 <w:color w:val="0B1F2E"/>
                 <w:sz w:val="19"/>
               </w:rPr>
-              <w:t>$9.00</w:t>
+              <w:t>N/A</w:t>
             </w:r>
           </w:p>
         </w:tc>
@@ -5834,7 +5342,7 @@
                 <w:color w:val="0B1F2E"/>
                 <w:sz w:val="19"/>
               </w:rPr>
-              <w:t>Basic 2vCPU — ecosystem premium</w:t>
+              <w:t>Usage-based, hard to compare directly</w:t>
             </w:r>
           </w:p>
         </w:tc>
@@ -5864,7 +5372,7 @@
                 <w:color w:val="0B1F2E"/>
                 <w:sz w:val="19"/>
               </w:rPr>
-              <w:t>Railway</w:t>
+              <w:t>Render</w:t>
             </w:r>
           </w:p>
         </w:tc>
@@ -5892,7 +5400,7 @@
                 <w:color w:val="0B1F2E"/>
                 <w:sz w:val="19"/>
               </w:rPr>
-              <w:t>~$10.00</w:t>
+              <w:t>$14.00</w:t>
             </w:r>
           </w:p>
         </w:tc>
@@ -5920,131 +5428,13 @@
                 <w:color w:val="0B1F2E"/>
                 <w:sz w:val="19"/>
               </w:rPr>
-              <w:t>N/A</w:t>
+              <w:t>$14.00</w:t>
             </w:r>
           </w:p>
         </w:tc>
         <w:tc>
           <w:tcPr>
             <w:tcW w:type="dxa" w:w="4320"/>
-            <w:tcMar>
-              <w:top w:w="80" w:type="dxa"/>
-              <w:start w:w="120" w:type="dxa"/>
-              <w:bottom w:w="80" w:type="dxa"/>
-              <w:end w:w="120" w:type="dxa"/>
-            </w:tcMar>
-            <w:vAlign w:val="center"/>
-          </w:tcPr>
-          <w:p>
-            <w:pPr>
-              <w:spacing w:after="20"/>
-            </w:pPr>
-            <w:r/>
-            <w:r>
-              <w:rPr>
-                <w:rFonts w:ascii="Segoe UI" w:hAnsi="Segoe UI" w:cs="Segoe UI"/>
-                <w:b w:val="0"/>
-                <w:i w:val="0"/>
-                <w:color w:val="0B1F2E"/>
-                <w:sz w:val="19"/>
-              </w:rPr>
-              <w:t>Usage-based, hard to compare directly</w:t>
-            </w:r>
-          </w:p>
-        </w:tc>
-      </w:tr>
-      <w:tr>
-        <w:tc>
-          <w:tcPr>
-            <w:tcW w:type="dxa" w:w="1728"/>
-            <w:shd w:val="clear" w:fill="F4F8FA"/>
-            <w:tcMar>
-              <w:top w:w="80" w:type="dxa"/>
-              <w:start w:w="120" w:type="dxa"/>
-              <w:bottom w:w="80" w:type="dxa"/>
-              <w:end w:w="120" w:type="dxa"/>
-            </w:tcMar>
-            <w:vAlign w:val="center"/>
-          </w:tcPr>
-          <w:p>
-            <w:pPr>
-              <w:spacing w:after="20"/>
-            </w:pPr>
-            <w:r/>
-            <w:r>
-              <w:rPr>
-                <w:rFonts w:ascii="Segoe UI" w:hAnsi="Segoe UI" w:cs="Segoe UI"/>
-                <w:b w:val="0"/>
-                <w:i w:val="0"/>
-                <w:color w:val="0B1F2E"/>
-                <w:sz w:val="19"/>
-              </w:rPr>
-              <w:t>Render</w:t>
-            </w:r>
-          </w:p>
-        </w:tc>
-        <w:tc>
-          <w:tcPr>
-            <w:tcW w:type="dxa" w:w="1728"/>
-            <w:shd w:val="clear" w:fill="F4F8FA"/>
-            <w:tcMar>
-              <w:top w:w="80" w:type="dxa"/>
-              <w:start w:w="120" w:type="dxa"/>
-              <w:bottom w:w="80" w:type="dxa"/>
-              <w:end w:w="120" w:type="dxa"/>
-            </w:tcMar>
-            <w:vAlign w:val="center"/>
-          </w:tcPr>
-          <w:p>
-            <w:pPr>
-              <w:spacing w:after="20"/>
-            </w:pPr>
-            <w:r/>
-            <w:r>
-              <w:rPr>
-                <w:rFonts w:ascii="Segoe UI" w:hAnsi="Segoe UI" w:cs="Segoe UI"/>
-                <w:b w:val="0"/>
-                <w:i w:val="0"/>
-                <w:color w:val="0B1F2E"/>
-                <w:sz w:val="19"/>
-              </w:rPr>
-              <w:t>$14.00</w:t>
-            </w:r>
-          </w:p>
-        </w:tc>
-        <w:tc>
-          <w:tcPr>
-            <w:tcW w:type="dxa" w:w="1728"/>
-            <w:shd w:val="clear" w:fill="F4F8FA"/>
-            <w:tcMar>
-              <w:top w:w="80" w:type="dxa"/>
-              <w:start w:w="120" w:type="dxa"/>
-              <w:bottom w:w="80" w:type="dxa"/>
-              <w:end w:w="120" w:type="dxa"/>
-            </w:tcMar>
-            <w:vAlign w:val="center"/>
-          </w:tcPr>
-          <w:p>
-            <w:pPr>
-              <w:spacing w:after="20"/>
-            </w:pPr>
-            <w:r/>
-            <w:r>
-              <w:rPr>
-                <w:rFonts w:ascii="Segoe UI" w:hAnsi="Segoe UI" w:cs="Segoe UI"/>
-                <w:b w:val="0"/>
-                <w:i w:val="0"/>
-                <w:color w:val="0B1F2E"/>
-                <w:sz w:val="19"/>
-              </w:rPr>
-              <w:t>$14.00</w:t>
-            </w:r>
-          </w:p>
-        </w:tc>
-        <w:tc>
-          <w:tcPr>
-            <w:tcW w:type="dxa" w:w="4320"/>
-            <w:shd w:val="clear" w:fill="F4F8FA"/>
             <w:tcMar>
               <w:top w:w="80" w:type="dxa"/>
               <w:start w:w="120" w:type="dxa"/>
@@ -6367,7 +5757,7 @@
                 <w:color w:val="0B1F2E"/>
                 <w:sz w:val="19"/>
               </w:rPr>
-              <w:t>Hetzner CX22 ($4.59)</w:t>
+              <w:t>Hostinger KVM 2 ($8.99)</w:t>
             </w:r>
           </w:p>
         </w:tc>
@@ -6395,7 +5785,7 @@
                 <w:color w:val="0B1F2E"/>
                 <w:sz w:val="19"/>
               </w:rPr>
-              <w:t>$4.59</w:t>
+              <w:t>$8.99</w:t>
             </w:r>
           </w:p>
         </w:tc>
@@ -6423,7 +5813,7 @@
                 <w:color w:val="0B1F2E"/>
                 <w:sz w:val="19"/>
               </w:rPr>
-              <w:t>$0.46</w:t>
+              <w:t>$0.90</w:t>
             </w:r>
           </w:p>
         </w:tc>
@@ -6512,7 +5902,7 @@
                 <w:color w:val="0B1F2E"/>
                 <w:sz w:val="19"/>
               </w:rPr>
-              <w:t>Hetzner CX22 ($4.59)</w:t>
+              <w:t>Hostinger KVM 2 ($8.99)</w:t>
             </w:r>
           </w:p>
         </w:tc>
@@ -6541,7 +5931,7 @@
                 <w:color w:val="0B1F2E"/>
                 <w:sz w:val="19"/>
               </w:rPr>
-              <w:t>$4.59</w:t>
+              <w:t>$8.99</w:t>
             </w:r>
           </w:p>
         </w:tc>
@@ -6570,7 +5960,7 @@
                 <w:color w:val="0B1F2E"/>
                 <w:sz w:val="19"/>
               </w:rPr>
-              <w:t>$0.31</w:t>
+              <w:t>$0.60</w:t>
             </w:r>
           </w:p>
         </w:tc>
@@ -6656,7 +6046,7 @@
                 <w:color w:val="0B1F2E"/>
                 <w:sz w:val="19"/>
               </w:rPr>
-              <w:t>Hetzner CX22 ($4.59)</w:t>
+              <w:t>Hostinger KVM 2 ($8.99)</w:t>
             </w:r>
           </w:p>
         </w:tc>
@@ -6684,7 +6074,7 @@
                 <w:color w:val="0B1F2E"/>
                 <w:sz w:val="19"/>
               </w:rPr>
-              <w:t>$4.59</w:t>
+              <w:t>$8.99</w:t>
             </w:r>
           </w:p>
         </w:tc>
@@ -6712,7 +6102,7 @@
                 <w:color w:val="0B1F2E"/>
                 <w:sz w:val="19"/>
               </w:rPr>
-              <w:t>$0.23</w:t>
+              <w:t>$0.45</w:t>
             </w:r>
           </w:p>
         </w:tc>
@@ -6801,7 +6191,7 @@
                 <w:color w:val="0B1F2E"/>
                 <w:sz w:val="19"/>
               </w:rPr>
-              <w:t>Hostinger KVM 2 ($8.99)</w:t>
+              <w:t>DigitalOcean 2vCPU ($18)</w:t>
             </w:r>
           </w:p>
         </w:tc>
@@ -6830,7 +6220,7 @@
                 <w:color w:val="0B1F2E"/>
                 <w:sz w:val="19"/>
               </w:rPr>
-              <w:t>$8.99</w:t>
+              <w:t>$18.00</w:t>
             </w:r>
           </w:p>
         </w:tc>
@@ -6859,7 +6249,7 @@
                 <w:color w:val="0B1F2E"/>
                 <w:sz w:val="19"/>
               </w:rPr>
-              <w:t>$0.90</w:t>
+              <w:t>$1.80</w:t>
             </w:r>
           </w:p>
         </w:tc>
@@ -6945,7 +6335,7 @@
                 <w:color w:val="0B1F2E"/>
                 <w:sz w:val="19"/>
               </w:rPr>
-              <w:t>Hostinger KVM 2 ($8.99)</w:t>
+              <w:t>DigitalOcean 2vCPU ($18)</w:t>
             </w:r>
           </w:p>
         </w:tc>
@@ -6973,7 +6363,7 @@
                 <w:color w:val="0B1F2E"/>
                 <w:sz w:val="19"/>
               </w:rPr>
-              <w:t>$8.99</w:t>
+              <w:t>$18.00</w:t>
             </w:r>
           </w:p>
         </w:tc>
@@ -7001,7 +6391,7 @@
                 <w:color w:val="0B1F2E"/>
                 <w:sz w:val="19"/>
               </w:rPr>
-              <w:t>$0.60</w:t>
+              <w:t>$1.20</w:t>
             </w:r>
           </w:p>
         </w:tc>
@@ -8275,7 +7665,7 @@
                 <w:color w:val="0B1F2E"/>
                 <w:sz w:val="19"/>
               </w:rPr>
-              <w:t>$4.59</w:t>
+              <w:t>$8.99</w:t>
             </w:r>
           </w:p>
         </w:tc>
@@ -8359,7 +7749,7 @@
                 <w:color w:val="0B1F2E"/>
                 <w:sz w:val="19"/>
               </w:rPr>
-              <w:t>$6.42</w:t>
+              <w:t>$11.04</w:t>
             </w:r>
           </w:p>
         </w:tc>
@@ -8387,7 +7777,7 @@
                 <w:color w:val="0B1F2E"/>
                 <w:sz w:val="19"/>
               </w:rPr>
-              <w:t>$87.04</w:t>
+              <w:t>$142.48</w:t>
             </w:r>
           </w:p>
         </w:tc>
@@ -8476,7 +7866,7 @@
                 <w:color w:val="0B1F2E"/>
                 <w:sz w:val="19"/>
               </w:rPr>
-              <w:t>$4.59</w:t>
+              <w:t>$8.99</w:t>
             </w:r>
           </w:p>
         </w:tc>
@@ -8563,7 +7953,7 @@
                 <w:color w:val="0B1F2E"/>
                 <w:sz w:val="19"/>
               </w:rPr>
-              <w:t>$8.29</w:t>
+              <w:t>$12.91</w:t>
             </w:r>
           </w:p>
         </w:tc>
@@ -8592,7 +7982,7 @@
                 <w:color w:val="0B1F2E"/>
                 <w:sz w:val="19"/>
               </w:rPr>
-              <w:t>$119.48</w:t>
+              <w:t>$174.92</w:t>
             </w:r>
           </w:p>
         </w:tc>
@@ -8678,7 +8068,7 @@
                 <w:color w:val="0B1F2E"/>
                 <w:sz w:val="19"/>
               </w:rPr>
-              <w:t>$13.77</w:t>
+              <w:t>$26.97</w:t>
             </w:r>
           </w:p>
         </w:tc>
@@ -8762,7 +8152,7 @@
                 <w:color w:val="0B1F2E"/>
                 <w:sz w:val="19"/>
               </w:rPr>
-              <w:t>$23.02</w:t>
+              <w:t>$36.22</w:t>
             </w:r>
           </w:p>
         </w:tc>
@@ -8790,7 +8180,7 @@
                 <w:color w:val="0B1F2E"/>
                 <w:sz w:val="19"/>
               </w:rPr>
-              <w:t>$326.24</w:t>
+              <w:t>$494.64</w:t>
             </w:r>
           </w:p>
         </w:tc>
@@ -8879,7 +8269,7 @@
                 <w:color w:val="0B1F2E"/>
                 <w:sz w:val="19"/>
               </w:rPr>
-              <w:t>$22.95</w:t>
+              <w:t>$44.95</w:t>
             </w:r>
           </w:p>
         </w:tc>
@@ -8966,7 +8356,7 @@
                 <w:color w:val="0B1F2E"/>
                 <w:sz w:val="19"/>
               </w:rPr>
-              <w:t>$38.45</w:t>
+              <w:t>$58.45</w:t>
             </w:r>
           </w:p>
         </w:tc>
@@ -8995,7 +8385,7 @@
                 <w:color w:val="0B1F2E"/>
                 <w:sz w:val="19"/>
               </w:rPr>
-              <w:t>$581.40</w:t>
+              <w:t>$821.40</w:t>
             </w:r>
           </w:p>
         </w:tc>
@@ -9081,7 +8471,7 @@
                 <w:color w:val="0B1F2E"/>
                 <w:sz w:val="19"/>
               </w:rPr>
-              <w:t>$45.90</w:t>
+              <w:t>$89.90</w:t>
             </w:r>
           </w:p>
         </w:tc>
@@ -9165,7 +8555,7 @@
                 <w:color w:val="0B1F2E"/>
                 <w:sz w:val="19"/>
               </w:rPr>
-              <w:t>$71.57</w:t>
+              <w:t>$114.57</w:t>
             </w:r>
           </w:p>
         </w:tc>
@@ -9193,7 +8583,7 @@
                 <w:color w:val="0B1F2E"/>
                 <w:sz w:val="19"/>
               </w:rPr>
-              <w:t>$1,118.84</w:t>
+              <w:t>$1,514.84</w:t>
             </w:r>
           </w:p>
         </w:tc>
@@ -9282,7 +8672,7 @@
                 <w:color w:val="0B1F2E"/>
                 <w:sz w:val="19"/>
               </w:rPr>
-              <w:t>$114.75</w:t>
+              <w:t>$224.75</w:t>
             </w:r>
           </w:p>
         </w:tc>
@@ -9369,7 +8759,7 @@
                 <w:color w:val="0B1F2E"/>
                 <w:sz w:val="19"/>
               </w:rPr>
-              <w:t>$177.25</w:t>
+              <w:t>$281.25</w:t>
             </w:r>
           </w:p>
         </w:tc>
@@ -9398,7 +8788,7 @@
                 <w:color w:val="0B1F2E"/>
                 <w:sz w:val="19"/>
               </w:rPr>
-              <w:t>$2,907.00</w:t>
+              <w:t>$4,017.00</w:t>
             </w:r>
           </w:p>
         </w:tc>
@@ -9610,7 +9000,7 @@
                 <w:color w:val="0B1F2E"/>
                 <w:sz w:val="19"/>
               </w:rPr>
-              <w:t>$6.42</w:t>
+              <w:t>$11.04</w:t>
             </w:r>
           </w:p>
         </w:tc>
@@ -9638,7 +9028,7 @@
                 <w:color w:val="0B1F2E"/>
                 <w:sz w:val="19"/>
               </w:rPr>
-              <w:t>$0.64</w:t>
+              <w:t>$1.10</w:t>
             </w:r>
           </w:p>
         </w:tc>
@@ -9666,7 +9056,7 @@
                 <w:color w:val="0B1F2E"/>
                 <w:sz w:val="19"/>
               </w:rPr>
-              <w:t>$7.74</w:t>
+              <w:t>$13.25</w:t>
             </w:r>
           </w:p>
         </w:tc>
@@ -9726,7 +9116,7 @@
                 <w:color w:val="0B1F2E"/>
                 <w:sz w:val="19"/>
               </w:rPr>
-              <w:t>$8.29</w:t>
+              <w:t>$12.91</w:t>
             </w:r>
           </w:p>
         </w:tc>
@@ -9755,7 +9145,7 @@
                 <w:color w:val="0B1F2E"/>
                 <w:sz w:val="19"/>
               </w:rPr>
-              <w:t>$0.41</w:t>
+              <w:t>$0.65</w:t>
             </w:r>
           </w:p>
         </w:tc>
@@ -9784,7 +9174,7 @@
                 <w:color w:val="0B1F2E"/>
                 <w:sz w:val="19"/>
               </w:rPr>
-              <w:t>$4.97</w:t>
+              <w:t>$7.75</w:t>
             </w:r>
           </w:p>
         </w:tc>
@@ -9842,7 +9232,7 @@
                 <w:color w:val="0B1F2E"/>
                 <w:sz w:val="19"/>
               </w:rPr>
-              <w:t>$23.02</w:t>
+              <w:t>$36.22</w:t>
             </w:r>
           </w:p>
         </w:tc>
@@ -9870,7 +9260,7 @@
                 <w:color w:val="0B1F2E"/>
                 <w:sz w:val="19"/>
               </w:rPr>
-              <w:t>$0.46</w:t>
+              <w:t>$0.72</w:t>
             </w:r>
           </w:p>
         </w:tc>
@@ -9898,7 +9288,7 @@
                 <w:color w:val="0B1F2E"/>
                 <w:sz w:val="19"/>
               </w:rPr>
-              <w:t>$5.53</w:t>
+              <w:t>$8.69</w:t>
             </w:r>
           </w:p>
         </w:tc>
@@ -9958,7 +9348,7 @@
                 <w:color w:val="0B1F2E"/>
                 <w:sz w:val="19"/>
               </w:rPr>
-              <w:t>$38.45</w:t>
+              <w:t>$58.45</w:t>
             </w:r>
           </w:p>
         </w:tc>
@@ -9987,7 +9377,7 @@
                 <w:color w:val="0B1F2E"/>
                 <w:sz w:val="19"/>
               </w:rPr>
-              <w:t>$0.38</w:t>
+              <w:t>$0.58</w:t>
             </w:r>
           </w:p>
         </w:tc>
@@ -10016,7 +9406,7 @@
                 <w:color w:val="0B1F2E"/>
                 <w:sz w:val="19"/>
               </w:rPr>
-              <w:t>$4.61</w:t>
+              <w:t>$7.01</w:t>
             </w:r>
           </w:p>
         </w:tc>
@@ -10074,7 +9464,7 @@
                 <w:color w:val="0B1F2E"/>
                 <w:sz w:val="19"/>
               </w:rPr>
-              <w:t>$71.57</w:t>
+              <w:t>$114.57</w:t>
             </w:r>
           </w:p>
         </w:tc>
@@ -10102,7 +9492,7 @@
                 <w:color w:val="0B1F2E"/>
                 <w:sz w:val="19"/>
               </w:rPr>
-              <w:t>$0.36</w:t>
+              <w:t>$0.57</w:t>
             </w:r>
           </w:p>
         </w:tc>
@@ -10130,7 +9520,7 @@
                 <w:color w:val="0B1F2E"/>
                 <w:sz w:val="19"/>
               </w:rPr>
-              <w:t>$4.29</w:t>
+              <w:t>$6.87</w:t>
             </w:r>
           </w:p>
         </w:tc>
@@ -10190,7 +9580,7 @@
                 <w:color w:val="0B1F2E"/>
                 <w:sz w:val="19"/>
               </w:rPr>
-              <w:t>$177.25</w:t>
+              <w:t>$281.25</w:t>
             </w:r>
           </w:p>
         </w:tc>
@@ -10219,7 +9609,7 @@
                 <w:color w:val="0B1F2E"/>
                 <w:sz w:val="19"/>
               </w:rPr>
-              <w:t>$0.35</w:t>
+              <w:t>$0.56</w:t>
             </w:r>
           </w:p>
         </w:tc>
@@ -10248,7 +9638,7 @@
                 <w:color w:val="0B1F2E"/>
                 <w:sz w:val="19"/>
               </w:rPr>
-              <w:t>$4.24</w:t>
+              <w:t>$6.75</w:t>
             </w:r>
           </w:p>
         </w:tc>
@@ -10311,7 +9701,7 @@
                 <w:color w:val="0B1F2E"/>
                 <w:sz w:val="20"/>
               </w:rPr>
-              <w:t>At 100+ clients, the cost per client drops below $0.40/month — less than the cost of a single SMS OTP. This makes the per-client hosting model highly profitable for a microfinance operation.</w:t>
+              <w:t>At 100+ clients, the cost per client drops below $0.60/month — well within profitable margins for a microfinance operation. The per-client model becomes increasingly efficient as you scale.</w:t>
             </w:r>
           </w:p>
         </w:tc>
@@ -10538,7 +9928,7 @@
                 <w:color w:val="0B1F2E"/>
                 <w:sz w:val="19"/>
               </w:rPr>
-              <w:t>3x Hetzner CX22 VPS</w:t>
+              <w:t>3x Hostinger KVM 2 VPS</w:t>
             </w:r>
           </w:p>
         </w:tc>
@@ -10566,7 +9956,7 @@
                 <w:color w:val="0B1F2E"/>
                 <w:sz w:val="19"/>
               </w:rPr>
-              <w:t>$13.77</w:t>
+              <w:t>$26.97</w:t>
             </w:r>
           </w:p>
         </w:tc>
@@ -10594,7 +9984,7 @@
                 <w:color w:val="0B1F2E"/>
                 <w:sz w:val="19"/>
               </w:rPr>
-              <w:t>$165.24</w:t>
+              <w:t>$323.64</w:t>
             </w:r>
           </w:p>
         </w:tc>
@@ -11606,7 +10996,7 @@
                 <w:color w:val="0B1F2E"/>
                 <w:sz w:val="19"/>
               </w:rPr>
-              <w:t>$83.19</w:t>
+              <w:t>$96.39</w:t>
             </w:r>
           </w:p>
         </w:tc>
@@ -11635,7 +11025,7 @@
                 <w:color w:val="0B1F2E"/>
                 <w:sz w:val="19"/>
               </w:rPr>
-              <w:t>$998.24</w:t>
+              <w:t>$1,156.64</w:t>
             </w:r>
           </w:p>
         </w:tc>
@@ -11655,7 +11045,7 @@
           <w:color w:val="0B1F2E"/>
           <w:sz w:val="21"/>
         </w:rPr>
-        <w:t>Cost per client: $1.66/month or $19.96/year (including labor).</w:t>
+        <w:t>Cost per client: $1.93/month or $23.13/year (including labor).</w:t>
       </w:r>
     </w:p>
     <w:p>
@@ -11832,7 +11222,7 @@
                 <w:color w:val="0B1F2E"/>
                 <w:sz w:val="19"/>
               </w:rPr>
-              <w:t>Hetzner CX22</w:t>
+              <w:t>Hostinger KVM 2</w:t>
             </w:r>
           </w:p>
         </w:tc>
@@ -11860,7 +11250,7 @@
                 <w:color w:val="0B1F2E"/>
                 <w:sz w:val="19"/>
               </w:rPr>
-              <w:t>$4.59/mo, 20TB bandwidth, 4GB RAM — unbeatable specs/price</w:t>
+              <w:t>$8.99/mo, 8GB RAM, 100GB NVMe — best specs/price in its class</w:t>
             </w:r>
           </w:p>
         </w:tc>
@@ -12273,7 +11663,7 @@
                 <w:color w:val="0B1F2E"/>
                 <w:sz w:val="20"/>
               </w:rPr>
-              <w:t>For NexusFinance per-client hosting, Hetzner Cloud (CX22) is the recommended choice. At $4.59/month for 2 vCPUs, 4GB RAM, and 20TB bandwidth, it delivers the best price-to-performance ratio. A single VPS can comfortably host 10-20 clients at a cost of $0.23-0.46 per client per month.</w:t>
+              <w:t>For NexusFinance per-client hosting, Hostinger KVM 2 is the recommended choice. At $8.99/month for 2 vCPUs, 8GB RAM, and 100GB NVMe storage, it delivers the best price-to-performance ratio. A single VPS can comfortably host 10-20 clients at a cost of $0.45-0.90 per client per month.</w:t>
             </w:r>
           </w:p>
         </w:tc>

</xml_diff>

<commit_message>
Fix hosting costing: Hostinger 8TB BW, DigitalOcean /mo correct specs
</commit_message>
<xml_diff>
--- a/DOC/NexusFinance_Private_Account_Hosting_Costing.docx
+++ b/DOC/NexusFinance_Private_Account_Hosting_Costing.docx
@@ -2138,7 +2138,7 @@
                 <w:color w:val="0B1F2E"/>
                 <w:sz w:val="19"/>
               </w:rPr>
-              <w:t>2 TB</w:t>
+              <w:t>8 TB</w:t>
             </w:r>
           </w:p>
         </w:tc>
@@ -2542,7 +2542,7 @@
                 <w:color w:val="0B1F2E"/>
                 <w:sz w:val="19"/>
               </w:rPr>
-              <w:t>2 GB</w:t>
+              <w:t>4 GB</w:t>
             </w:r>
           </w:p>
         </w:tc>
@@ -2570,7 +2570,7 @@
                 <w:color w:val="0B1F2E"/>
                 <w:sz w:val="19"/>
               </w:rPr>
-              <w:t>60 GB SSD</w:t>
+              <w:t>80 GB SSD</w:t>
             </w:r>
           </w:p>
         </w:tc>
@@ -2598,7 +2598,7 @@
                 <w:color w:val="0B1F2E"/>
                 <w:sz w:val="19"/>
               </w:rPr>
-              <w:t>3 TB</w:t>
+              <w:t>4 TB</w:t>
             </w:r>
           </w:p>
         </w:tc>
@@ -2626,7 +2626,7 @@
                 <w:color w:val="0B1F2E"/>
                 <w:sz w:val="19"/>
               </w:rPr>
-              <w:t>$18.00</w:t>
+              <w:t>$24.00</w:t>
             </w:r>
           </w:p>
         </w:tc>
@@ -2654,7 +2654,7 @@
                 <w:color w:val="0B1F2E"/>
                 <w:sz w:val="19"/>
               </w:rPr>
-              <w:t>$216.00</w:t>
+              <w:t>$288.00</w:t>
             </w:r>
           </w:p>
         </w:tc>
@@ -5168,7 +5168,7 @@
                 <w:color w:val="0B1F2E"/>
                 <w:sz w:val="19"/>
               </w:rPr>
-              <w:t>$9.00</w:t>
+              <w:t>$6.00</w:t>
             </w:r>
           </w:p>
         </w:tc>
@@ -5196,7 +5196,7 @@
                 <w:color w:val="0B1F2E"/>
                 <w:sz w:val="19"/>
               </w:rPr>
-              <w:t>$9.00</w:t>
+              <w:t>$12.00</w:t>
             </w:r>
           </w:p>
         </w:tc>
@@ -6191,7 +6191,7 @@
                 <w:color w:val="0B1F2E"/>
                 <w:sz w:val="19"/>
               </w:rPr>
-              <w:t>DigitalOcean 2vCPU ($18)</w:t>
+              <w:t>DigitalOcean 2vCPU ($24)</w:t>
             </w:r>
           </w:p>
         </w:tc>
@@ -6220,7 +6220,7 @@
                 <w:color w:val="0B1F2E"/>
                 <w:sz w:val="19"/>
               </w:rPr>
-              <w:t>$18.00</w:t>
+              <w:t>$24.00</w:t>
             </w:r>
           </w:p>
         </w:tc>
@@ -6249,7 +6249,7 @@
                 <w:color w:val="0B1F2E"/>
                 <w:sz w:val="19"/>
               </w:rPr>
-              <w:t>$1.80</w:t>
+              <w:t>$2.40</w:t>
             </w:r>
           </w:p>
         </w:tc>
@@ -6335,7 +6335,7 @@
                 <w:color w:val="0B1F2E"/>
                 <w:sz w:val="19"/>
               </w:rPr>
-              <w:t>DigitalOcean 2vCPU ($18)</w:t>
+              <w:t>DigitalOcean 2vCPU ($24)</w:t>
             </w:r>
           </w:p>
         </w:tc>
@@ -6363,7 +6363,7 @@
                 <w:color w:val="0B1F2E"/>
                 <w:sz w:val="19"/>
               </w:rPr>
-              <w:t>$18.00</w:t>
+              <w:t>$24.00</w:t>
             </w:r>
           </w:p>
         </w:tc>
@@ -6391,7 +6391,7 @@
                 <w:color w:val="0B1F2E"/>
                 <w:sz w:val="19"/>
               </w:rPr>
-              <w:t>$1.20</w:t>
+              <w:t>$1.60</w:t>
             </w:r>
           </w:p>
         </w:tc>

</xml_diff>